<commit_message>
feat: finalize rule extraction integration and update disclosure doc
</commit_message>
<xml_diff>
--- a/LangAI3.0_AI_Disclosure.docx
+++ b/LangAI3.0_AI_Disclosure.docx
@@ -213,25 +213,131 @@
           <w:b/>
           <w:bCs/>
         </w:rPr>
-        <w:t xml:space="preserve"> </w:t>
+        <w:t xml:space="preserve"> No</w:t>
+      </w:r>
+      <w:r>
+        <w:t>_________</w:t>
+      </w:r>
+    </w:p>
+    <w:p>
+      <w:pPr>
+        <w:rPr>
+          <w:lang w:val="en-IN"/>
+        </w:rPr>
+      </w:pPr>
+      <w:r>
+        <w:t>Code generation or assistance</w:t>
+      </w:r>
+      <w:r>
+        <w:t xml:space="preserve"> _______</w:t>
       </w:r>
       <w:r>
         <w:rPr>
           <w:b/>
           <w:bCs/>
         </w:rPr>
-        <w:t>No</w:t>
-      </w:r>
-      <w:r>
-        <w:t>_________</w:t>
+        <w:t xml:space="preserve"> Yes </w:t>
+      </w:r>
+      <w:r>
+        <w:rPr>
+          <w:lang w:val="en-IN"/>
+        </w:rPr>
+        <w:t>(</w:t>
+      </w:r>
+      <w:r>
+        <w:rPr>
+          <w:b/>
+          <w:bCs/>
+          <w:lang w:val="en-IN"/>
+        </w:rPr>
+        <w:t xml:space="preserve">Regex optimization, TF-IDF algorithm tuning, </w:t>
+      </w:r>
+      <w:proofErr w:type="spellStart"/>
+      <w:r>
+        <w:rPr>
+          <w:b/>
+          <w:bCs/>
+          <w:lang w:val="en-IN"/>
+        </w:rPr>
+        <w:t>Dockerization</w:t>
+      </w:r>
+      <w:proofErr w:type="spellEnd"/>
+      <w:r>
+        <w:rPr>
+          <w:b/>
+          <w:bCs/>
+          <w:lang w:val="en-IN"/>
+        </w:rPr>
+        <w:t xml:space="preserve">, </w:t>
+      </w:r>
+      <w:proofErr w:type="spellStart"/>
+      <w:r>
+        <w:rPr>
+          <w:b/>
+          <w:bCs/>
+          <w:lang w:val="en-IN"/>
+        </w:rPr>
+        <w:t>deeplink</w:t>
+      </w:r>
+      <w:proofErr w:type="spellEnd"/>
+      <w:r>
+        <w:rPr>
+          <w:b/>
+          <w:bCs/>
+          <w:lang w:val="en-IN"/>
+        </w:rPr>
+        <w:t xml:space="preserve"> category guard, API response models)</w:t>
       </w:r>
     </w:p>
     <w:p>
       <w:r>
-        <w:t>Code generation or assistance</w:t>
-      </w:r>
-      <w:r>
-        <w:t xml:space="preserve"> _______</w:t>
+        <w:t>UI / UX design</w:t>
+      </w:r>
+      <w:r>
+        <w:t xml:space="preserve"> ___________</w:t>
+      </w:r>
+      <w:r>
+        <w:rPr>
+          <w:b/>
+          <w:bCs/>
+        </w:rPr>
+        <w:t xml:space="preserve"> No</w:t>
+      </w:r>
+      <w:r>
+        <w:t>_____</w:t>
+      </w:r>
+    </w:p>
+    <w:p>
+      <w:r>
+        <w:t>Content creation</w:t>
+      </w:r>
+      <w:r>
+        <w:t xml:space="preserve"> ________</w:t>
+      </w:r>
+      <w:r>
+        <w:rPr>
+          <w:b/>
+          <w:bCs/>
+        </w:rPr>
+        <w:t xml:space="preserve"> No</w:t>
+      </w:r>
+      <w:r>
+        <w:t>________</w:t>
+      </w:r>
+    </w:p>
+    <w:p>
+      <w:pPr>
+        <w:rPr>
+          <w:b/>
+          <w:bCs/>
+          <w:lang w:val="en-IN"/>
+        </w:rPr>
+      </w:pPr>
+      <w:r>
+        <w:t>Data analysis</w:t>
+      </w:r>
+      <w:r>
+        <w:t xml:space="preserve"> ______</w:t>
       </w:r>
       <w:r>
         <w:rPr>
@@ -240,23 +346,30 @@
         </w:rPr>
         <w:t xml:space="preserve"> </w:t>
       </w:r>
+      <w:proofErr w:type="gramStart"/>
       <w:r>
         <w:rPr>
           <w:b/>
           <w:bCs/>
         </w:rPr>
-        <w:t xml:space="preserve">Yes </w:t>
-      </w:r>
-      <w:r>
-        <w:t>_________</w:t>
-      </w:r>
-    </w:p>
-    <w:p>
-      <w:r>
-        <w:t>UI / UX design</w:t>
-      </w:r>
-      <w:r>
-        <w:t xml:space="preserve"> ___________</w:t>
+        <w:t>Yes</w:t>
+      </w:r>
+      <w:r>
+        <w:rPr>
+          <w:b/>
+          <w:bCs/>
+          <w:lang w:val="en-IN"/>
+        </w:rPr>
+        <w:t>(</w:t>
+      </w:r>
+      <w:proofErr w:type="gramEnd"/>
+      <w:r>
+        <w:rPr>
+          <w:b/>
+          <w:bCs/>
+          <w:lang w:val="en-IN"/>
+        </w:rPr>
+        <w:t>Parsing and restructuring the SIIS mock dataset)</w:t>
       </w:r>
       <w:r>
         <w:rPr>
@@ -266,86 +379,22 @@
         <w:t xml:space="preserve"> </w:t>
       </w:r>
       <w:r>
+        <w:t>_________</w:t>
+      </w:r>
+    </w:p>
+    <w:p>
+      <w:r>
+        <w:t>Testing / debugging</w:t>
+      </w:r>
+      <w:r>
+        <w:t xml:space="preserve"> ______</w:t>
+      </w:r>
+      <w:r>
         <w:rPr>
           <w:b/>
           <w:bCs/>
         </w:rPr>
-        <w:t>No</w:t>
-      </w:r>
-      <w:r>
-        <w:t>_____</w:t>
-      </w:r>
-    </w:p>
-    <w:p>
-      <w:r>
-        <w:t>Content creation</w:t>
-      </w:r>
-      <w:r>
-        <w:t xml:space="preserve"> ________</w:t>
-      </w:r>
-      <w:r>
-        <w:rPr>
-          <w:b/>
-          <w:bCs/>
-        </w:rPr>
-        <w:t xml:space="preserve"> </w:t>
-      </w:r>
-      <w:r>
-        <w:rPr>
-          <w:b/>
-          <w:bCs/>
-        </w:rPr>
-        <w:t>No</w:t>
-      </w:r>
-      <w:r>
-        <w:t>________</w:t>
-      </w:r>
-    </w:p>
-    <w:p>
-      <w:r>
-        <w:t>Data analysis</w:t>
-      </w:r>
-      <w:r>
-        <w:t xml:space="preserve"> ______</w:t>
-      </w:r>
-      <w:r>
-        <w:rPr>
-          <w:b/>
-          <w:bCs/>
-        </w:rPr>
-        <w:t xml:space="preserve"> </w:t>
-      </w:r>
-      <w:r>
-        <w:rPr>
-          <w:b/>
-          <w:bCs/>
-        </w:rPr>
-        <w:t xml:space="preserve">Yes </w:t>
-      </w:r>
-      <w:r>
-        <w:t>_________</w:t>
-      </w:r>
-    </w:p>
-    <w:p>
-      <w:r>
-        <w:t>Testing / debugging</w:t>
-      </w:r>
-      <w:r>
-        <w:t xml:space="preserve"> ______</w:t>
-      </w:r>
-      <w:r>
-        <w:rPr>
-          <w:b/>
-          <w:bCs/>
-        </w:rPr>
-        <w:t xml:space="preserve"> </w:t>
-      </w:r>
-      <w:r>
-        <w:rPr>
-          <w:b/>
-          <w:bCs/>
-        </w:rPr>
-        <w:t xml:space="preserve">Yes </w:t>
+        <w:t xml:space="preserve"> Yes </w:t>
       </w:r>
       <w:r>
         <w:rPr>
@@ -542,6 +591,7 @@
         <w:t xml:space="preserve">"). </w:t>
       </w:r>
       <w:r>
+        <w:lastRenderedPageBreak/>
         <w:t>We</w:t>
       </w:r>
       <w:r>
@@ -558,11 +608,7 @@
     </w:p>
     <w:p>
       <w:r>
-        <w:lastRenderedPageBreak/>
-        <w:t xml:space="preserve">1. Feature Name </w:t>
-      </w:r>
-      <w:r>
-        <w:t xml:space="preserve">- </w:t>
+        <w:t xml:space="preserve">1. Feature Name - </w:t>
       </w:r>
       <w:r>
         <w:rPr>
@@ -627,24 +673,14 @@
     </w:p>
     <w:p>
       <w:r>
-        <w:t xml:space="preserve">1. Feature Name </w:t>
-      </w:r>
-      <w:r>
-        <w:t xml:space="preserve">- </w:t>
+        <w:t xml:space="preserve">1. Feature Name - </w:t>
       </w:r>
       <w:r>
         <w:rPr>
           <w:b/>
           <w:bCs/>
         </w:rPr>
-        <w:t>Concurrency</w:t>
-      </w:r>
-      <w:r>
-        <w:rPr>
-          <w:b/>
-          <w:bCs/>
-        </w:rPr>
-        <w:t xml:space="preserve"> Locks &amp; Deployment Setup</w:t>
+        <w:t>Concurrency Locks &amp; Deployment Setup</w:t>
       </w:r>
     </w:p>
     <w:p>
@@ -652,10 +688,7 @@
         <w:t>2.  Self-Generated/AI-Generated/Both ________</w:t>
       </w:r>
       <w:r>
-        <w:t xml:space="preserve"> </w:t>
-      </w:r>
-      <w:r>
-        <w:t>AI-Generated</w:t>
+        <w:t xml:space="preserve"> AI-Generated</w:t>
       </w:r>
       <w:r>
         <w:t>___________</w:t>
@@ -690,10 +723,7 @@
         <w:t>__________________</w:t>
       </w:r>
       <w:r>
-        <w:t xml:space="preserve"> </w:t>
-      </w:r>
-      <w:r>
-        <w:t xml:space="preserve">Description: Tool Used: Google Gemini. Prompt used: "Create a </w:t>
+        <w:t xml:space="preserve"> Description: Tool Used: Google Gemini. Prompt used: "Create a </w:t>
       </w:r>
       <w:proofErr w:type="spellStart"/>
       <w:r>
@@ -818,10 +848,7 @@
         <w:t>Role:</w:t>
       </w:r>
       <w:r>
-        <w:t xml:space="preserve"> </w:t>
-      </w:r>
-      <w:r>
-        <w:t>Team Leader</w:t>
+        <w:t xml:space="preserve"> Team Leader</w:t>
       </w:r>
     </w:p>
     <w:p>

</xml_diff>